<commit_message>
Stage 1-2 implementation: IPPO baseline + ExplabOff MI-enhanced MARL
- ActorCriticNetwork: MLP backbone with softmax policy + value heads
- IPPOAgent: PPO with GAE, parameter sharing, agent_id embedding
- ExplabOffAgent: MI-enhanced rewards, InfoNCE+L1Out estimators, B+/B- dual buffers
- Stage1Trainer: training loop + TensorBoard + checkpoint save/load
- Stage2Trainer: MI training loop + episode classification + MI estimator updates
- Networks: InfoNCE contrastive loss, L1Out variational upper bound
- Action mapping: discrete_to_dict for PettingZoo Dict action space

References: de Witt et al. (ICLR 2020), Ren et al. (INFOCOM 2025)
</commit_message>
<xml_diff>
--- a/PROJECT_MANUAL.docx
+++ b/PROJECT_MANUAL.docx
@@ -39,6 +39,7 @@
       <w:r>
         <w:rPr>
           <w:sz w:val="22"/>
+          <w:color w:val="000000"/>
         </w:rPr>
         <w:t>PettingZoo + PyTorch + NetworkX</w:t>
       </w:r>
@@ -50,6 +51,7 @@
       <w:r>
         <w:rPr>
           <w:sz w:val="20"/>
+          <w:color w:val="000000"/>
         </w:rPr>
         <w:t>版本 1.0  ｜  2026 年 5 月</w:t>
       </w:r>
@@ -57,6 +59,9 @@
     <w:p>
       <w:r>
         <w:br w:type="page"/>
+        <w:rPr>
+          <w:color w:val="000000"/>
+        </w:rPr>
       </w:r>
     </w:p>
     <w:p>
@@ -65,6 +70,9 @@
       </w:pPr>
       <w:r>
         <w:t>1. 项目概述</w:t>
+        <w:rPr>
+          <w:color w:val="000000"/>
+        </w:rPr>
       </w:r>
     </w:p>
     <w:p>
@@ -72,6 +80,7 @@
         <w:rPr>
           <w:b w:val="0"/>
           <w:i w:val="0"/>
+          <w:color w:val="000000"/>
         </w:rPr>
         <w:t>本项目解决移动边缘计算（MEC）中的多智能体任务卸载问题。多台移动设备（MD）产生计算密集型任务，需在本地处理器和边缘服务器（ES）之间进行调度，以最小化系统延迟和能耗，同时保证公平性。</w:t>
       </w:r>
@@ -82,6 +91,9 @@
       </w:pPr>
       <w:r>
         <w:t>1.1 核心挑战</w:t>
+        <w:rPr>
+          <w:color w:val="000000"/>
+        </w:rPr>
       </w:r>
     </w:p>
     <w:p>
@@ -89,6 +101,7 @@
         <w:rPr>
           <w:b w:val="0"/>
           <w:i w:val="0"/>
+          <w:color w:val="000000"/>
         </w:rPr>
         <w:t>可扩展性：支持从 5 台设备扩展到 50+ 台，算法需保持收敛。</w:t>
       </w:r>
@@ -98,6 +111,7 @@
         <w:rPr>
           <w:b w:val="0"/>
           <w:i w:val="0"/>
+          <w:color w:val="000000"/>
         </w:rPr>
         <w:t>隐式协作：无 D2D 直连通信，多设备需通过 CTDE 训练隐式协调。</w:t>
       </w:r>
@@ -107,6 +121,7 @@
         <w:rPr>
           <w:b w:val="0"/>
           <w:i w:val="0"/>
+          <w:color w:val="000000"/>
         </w:rPr>
         <w:t>公平性与可解释性：防止少数设备独占资源；决策过程可追溯。</w:t>
       </w:r>
@@ -117,6 +132,9 @@
       </w:pPr>
       <w:r>
         <w:t>1.2 四阶段划分</w:t>
+        <w:rPr>
+          <w:color w:val="000000"/>
+        </w:rPr>
       </w:r>
     </w:p>
     <w:tbl>
@@ -348,6 +366,9 @@
       </w:pPr>
       <w:r>
         <w:t>2. 系统架构</w:t>
+        <w:rPr>
+          <w:color w:val="000000"/>
+        </w:rPr>
       </w:r>
     </w:p>
     <w:p>
@@ -355,6 +376,7 @@
         <w:rPr>
           <w:b w:val="0"/>
           <w:i w:val="0"/>
+          <w:color w:val="000000"/>
         </w:rPr>
         <w:t>系统由 M 台移动设备（MD）和 E 台边缘服务器（ES）组成。时间划分为 N 个等长时隙。每时隙，每台 MD 独立决策：</w:t>
       </w:r>
@@ -364,6 +386,7 @@
         <w:rPr>
           <w:b/>
           <w:i w:val="0"/>
+          <w:color w:val="000000"/>
         </w:rPr>
         <w:t>卸载比例</w:t>
       </w:r>
@@ -433,6 +456,7 @@
         <w:rPr>
           <w:b w:val="0"/>
           <w:i w:val="0"/>
+          <w:color w:val="000000"/>
         </w:rPr>
         <w:t xml:space="preserve">  和目标服务器  </w:t>
       </w:r>
@@ -440,6 +464,7 @@
         <w:rPr>
           <w:b w:val="0"/>
           <w:i w:val="0"/>
+          <w:color w:val="000000"/>
         </w:rPr>
         <w:t>（0 = 本地执行）。</w:t>
       </w:r>
@@ -450,6 +475,9 @@
       </w:pPr>
       <w:r>
         <w:t>2.1 设备模型</w:t>
+        <w:rPr>
+          <w:color w:val="000000"/>
+        </w:rPr>
       </w:r>
     </w:p>
     <w:p>
@@ -457,6 +485,7 @@
         <w:rPr>
           <w:b w:val="0"/>
           <w:i w:val="0"/>
+          <w:color w:val="000000"/>
         </w:rPr>
         <w:t xml:space="preserve">移动设备 MD：CPU  </w:t>
       </w:r>
@@ -565,6 +594,7 @@
         <w:rPr>
           <w:b w:val="0"/>
           <w:i w:val="0"/>
+          <w:color w:val="000000"/>
         </w:rPr>
         <w:t xml:space="preserve">（Hz）、能量预算  </w:t>
       </w:r>
@@ -572,6 +602,7 @@
         <w:rPr>
           <w:b w:val="0"/>
           <w:i w:val="0"/>
+          <w:color w:val="000000"/>
         </w:rPr>
         <w:t xml:space="preserve">（J）。每时隙到达任务  </w:t>
       </w:r>
@@ -579,6 +610,7 @@
         <w:rPr>
           <w:b w:val="0"/>
           <w:i w:val="0"/>
+          <w:color w:val="000000"/>
         </w:rPr>
         <w:t>（数据量、CPU 周期/bit、最大容忍延迟）。</w:t>
       </w:r>
@@ -588,6 +620,7 @@
         <w:rPr>
           <w:b w:val="0"/>
           <w:i w:val="0"/>
+          <w:color w:val="000000"/>
         </w:rPr>
         <w:t xml:space="preserve">边缘服务器 ES：CPU  </w:t>
       </w:r>
@@ -629,6 +662,7 @@
         <w:rPr>
           <w:b w:val="0"/>
           <w:i w:val="0"/>
+          <w:color w:val="000000"/>
         </w:rPr>
         <w:t xml:space="preserve">（Hz）、任务队列  </w:t>
       </w:r>
@@ -636,6 +670,7 @@
         <w:rPr>
           <w:b w:val="0"/>
           <w:i w:val="0"/>
+          <w:color w:val="000000"/>
         </w:rPr>
         <w:t>。MD 之间无 D2D 直接通信。</w:t>
       </w:r>
@@ -646,6 +681,9 @@
       </w:pPr>
       <w:r>
         <w:t>2.2 通信模型</w:t>
+        <w:rPr>
+          <w:color w:val="000000"/>
+        </w:rPr>
       </w:r>
     </w:p>
     <w:p>
@@ -653,6 +691,7 @@
         <w:rPr>
           <w:b w:val="0"/>
           <w:i w:val="0"/>
+          <w:color w:val="000000"/>
         </w:rPr>
         <w:t>采用块衰落信道模型（Jakes 小尺度 + LTE 大尺度阴影）。</w:t>
       </w:r>
@@ -662,6 +701,7 @@
         <w:rPr>
           <w:b w:val="0"/>
           <w:i w:val="0"/>
+          <w:color w:val="000000"/>
         </w:rPr>
         <w:t>传输速率（Shannon 公式）：</w:t>
       </w:r>
@@ -831,6 +871,7 @@
         <w:rPr>
           <w:b w:val="0"/>
           <w:i w:val="0"/>
+          <w:color w:val="000000"/>
         </w:rPr>
         <w:t xml:space="preserve">干扰  </w:t>
       </w:r>
@@ -867,6 +908,7 @@
         <w:rPr>
           <w:b w:val="0"/>
           <w:i w:val="0"/>
+          <w:color w:val="000000"/>
         </w:rPr>
         <w:t xml:space="preserve">  对除自己外所有同时卸载的 MD 求和。</w:t>
       </w:r>
@@ -877,6 +919,9 @@
       </w:pPr>
       <w:r>
         <w:t>2.3 MDP 形式化</w:t>
+        <w:rPr>
+          <w:color w:val="000000"/>
+        </w:rPr>
       </w:r>
     </w:p>
     <w:p>
@@ -884,6 +929,7 @@
         <w:rPr>
           <w:b w:val="0"/>
           <w:i w:val="0"/>
+          <w:color w:val="000000"/>
         </w:rPr>
         <w:t>5-元组 (s, a, P, γ, r)：</w:t>
       </w:r>
@@ -893,6 +939,7 @@
         <w:rPr>
           <w:b w:val="0"/>
           <w:i w:val="0"/>
+          <w:color w:val="000000"/>
         </w:rPr>
         <w:t>状态：所有 MD 任务信息 + 所有 ES 队列 + 所有 MD 剩余能量。</w:t>
       </w:r>
@@ -902,6 +949,7 @@
         <w:rPr>
           <w:b w:val="0"/>
           <w:i w:val="0"/>
+          <w:color w:val="000000"/>
         </w:rPr>
         <w:t>动作：所有 MD 的 (ρ, ε) 联合动作。</w:t>
       </w:r>
@@ -911,6 +959,7 @@
         <w:rPr>
           <w:b w:val="0"/>
           <w:i w:val="0"/>
+          <w:color w:val="000000"/>
         </w:rPr>
         <w:t>奖励：</w:t>
       </w:r>
@@ -962,6 +1011,7 @@
         <w:rPr>
           <w:b w:val="0"/>
           <w:i w:val="0"/>
+          <w:color w:val="000000"/>
         </w:rPr>
         <w:t>其中 C_n 为加权延迟 + 能耗。执行时采用 Dec-POMDP：每个 MD 仅观测局部状态。</w:t>
       </w:r>
@@ -972,6 +1022,9 @@
       </w:pPr>
       <w:r>
         <w:t>3. 项目目录结构</w:t>
+        <w:rPr>
+          <w:color w:val="000000"/>
+        </w:rPr>
       </w:r>
     </w:p>
     <w:p>
@@ -981,6 +1034,7 @@
           <w:b w:val="0"/>
           <w:i w:val="0"/>
           <w:sz w:val="18"/>
+          <w:color w:val="000000"/>
         </w:rPr>
         <w:t>MARL-IPPOAndMore/</w:t>
       </w:r>
@@ -989,6 +1043,7 @@
           <w:b w:val="0"/>
           <w:i w:val="0"/>
           <w:sz w:val="18"/>
+          <w:color w:val="000000"/>
         </w:rPr>
         <w:t xml:space="preserve">  — 项目根目录</w:t>
       </w:r>
@@ -1000,6 +1055,7 @@
           <w:b w:val="0"/>
           <w:i w:val="0"/>
           <w:sz w:val="18"/>
+          <w:color w:val="000000"/>
         </w:rPr>
         <w:t xml:space="preserve">  ├── DESIGN_DOCUMENT.md</w:t>
       </w:r>
@@ -1008,6 +1064,7 @@
           <w:b w:val="0"/>
           <w:i w:val="0"/>
           <w:sz w:val="18"/>
+          <w:color w:val="000000"/>
         </w:rPr>
         <w:t xml:space="preserve">  — 完整架构设计文档（9 章）</w:t>
       </w:r>
@@ -1019,6 +1076,7 @@
           <w:b w:val="0"/>
           <w:i w:val="0"/>
           <w:sz w:val="18"/>
+          <w:color w:val="000000"/>
         </w:rPr>
         <w:t xml:space="preserve">  ├── PROJECT_MANUAL.docx</w:t>
       </w:r>
@@ -1027,6 +1085,7 @@
           <w:b w:val="0"/>
           <w:i w:val="0"/>
           <w:sz w:val="18"/>
+          <w:color w:val="000000"/>
         </w:rPr>
         <w:t xml:space="preserve">  — 本手册</w:t>
       </w:r>
@@ -1038,6 +1097,7 @@
           <w:b w:val="0"/>
           <w:i w:val="0"/>
           <w:sz w:val="18"/>
+          <w:color w:val="000000"/>
         </w:rPr>
         <w:t xml:space="preserve">  ├── papers/</w:t>
       </w:r>
@@ -1046,6 +1106,7 @@
           <w:b w:val="0"/>
           <w:i w:val="0"/>
           <w:sz w:val="18"/>
+          <w:color w:val="000000"/>
         </w:rPr>
         <w:t xml:space="preserve">  — 参考论文（8 篇 PDF + REFERENCES.md）</w:t>
       </w:r>
@@ -1057,6 +1118,7 @@
           <w:b w:val="0"/>
           <w:i w:val="0"/>
           <w:sz w:val="18"/>
+          <w:color w:val="000000"/>
         </w:rPr>
         <w:t xml:space="preserve">  ├── envs/</w:t>
       </w:r>
@@ -1065,6 +1127,7 @@
           <w:b w:val="0"/>
           <w:i w:val="0"/>
           <w:sz w:val="18"/>
+          <w:color w:val="000000"/>
         </w:rPr>
         <w:t xml:space="preserve">  — PettingZoo 环境实现</w:t>
       </w:r>
@@ -1076,6 +1139,7 @@
           <w:b w:val="0"/>
           <w:i w:val="0"/>
           <w:sz w:val="18"/>
+          <w:color w:val="000000"/>
         </w:rPr>
         <w:t xml:space="preserve">  │   └── edge_offload_env.py</w:t>
       </w:r>
@@ -1084,6 +1148,7 @@
           <w:b w:val="0"/>
           <w:i w:val="0"/>
           <w:sz w:val="18"/>
+          <w:color w:val="000000"/>
         </w:rPr>
         <w:t xml:space="preserve">  — ParallelEnv：多设备边缘卸载仿真</w:t>
       </w:r>
@@ -1095,6 +1160,7 @@
           <w:b w:val="0"/>
           <w:i w:val="0"/>
           <w:sz w:val="18"/>
+          <w:color w:val="000000"/>
         </w:rPr>
         <w:t xml:space="preserve">  ├── agents/</w:t>
       </w:r>
@@ -1103,6 +1169,7 @@
           <w:b w:val="0"/>
           <w:i w:val="0"/>
           <w:sz w:val="18"/>
+          <w:color w:val="000000"/>
         </w:rPr>
         <w:t xml:space="preserve">  — 强化学习智能体</w:t>
       </w:r>
@@ -1114,6 +1181,7 @@
           <w:b w:val="0"/>
           <w:i w:val="0"/>
           <w:sz w:val="18"/>
+          <w:color w:val="000000"/>
         </w:rPr>
         <w:t xml:space="preserve">  │   ├── ippo_agent.py</w:t>
       </w:r>
@@ -1122,6 +1190,7 @@
           <w:b w:val="0"/>
           <w:i w:val="0"/>
           <w:sz w:val="18"/>
+          <w:color w:val="000000"/>
         </w:rPr>
         <w:t xml:space="preserve">  — Stage 1：独立 PPO（桩代码）</w:t>
       </w:r>
@@ -1133,6 +1202,7 @@
           <w:b w:val="0"/>
           <w:i w:val="0"/>
           <w:sz w:val="18"/>
+          <w:color w:val="000000"/>
         </w:rPr>
         <w:t xml:space="preserve">  │   ├── mappo_agent.py</w:t>
       </w:r>
@@ -1141,6 +1211,7 @@
           <w:b w:val="0"/>
           <w:i w:val="0"/>
           <w:sz w:val="18"/>
+          <w:color w:val="000000"/>
         </w:rPr>
         <w:t xml:space="preserve">  — MAPPO 对比基线（桩代码）</w:t>
       </w:r>
@@ -1152,6 +1223,7 @@
           <w:b w:val="0"/>
           <w:i w:val="0"/>
           <w:sz w:val="18"/>
+          <w:color w:val="000000"/>
         </w:rPr>
         <w:t xml:space="preserve">  │   ├── explaboff_agent.py</w:t>
       </w:r>
@@ -1160,6 +1232,7 @@
           <w:b w:val="0"/>
           <w:i w:val="0"/>
           <w:sz w:val="18"/>
+          <w:color w:val="000000"/>
         </w:rPr>
         <w:t xml:space="preserve">  — Stage 2：ExplabOff（桩代码）</w:t>
       </w:r>
@@ -1171,6 +1244,7 @@
           <w:b w:val="0"/>
           <w:i w:val="0"/>
           <w:sz w:val="18"/>
+          <w:color w:val="000000"/>
         </w:rPr>
         <w:t xml:space="preserve">  │   └── networks/</w:t>
       </w:r>
@@ -1179,6 +1253,7 @@
           <w:b w:val="0"/>
           <w:i w:val="0"/>
           <w:sz w:val="18"/>
+          <w:color w:val="000000"/>
         </w:rPr>
         <w:t xml:space="preserve">  — 神经网络模块</w:t>
       </w:r>
@@ -1190,6 +1265,7 @@
           <w:b w:val="0"/>
           <w:i w:val="0"/>
           <w:sz w:val="18"/>
+          <w:color w:val="000000"/>
         </w:rPr>
         <w:t xml:space="preserve">  │       ├── actor_critic.py</w:t>
       </w:r>
@@ -1198,6 +1274,7 @@
           <w:b w:val="0"/>
           <w:i w:val="0"/>
           <w:sz w:val="18"/>
+          <w:color w:val="000000"/>
         </w:rPr>
         <w:t xml:space="preserve">  — Actor-Critic 架构</w:t>
       </w:r>
@@ -1209,6 +1286,7 @@
           <w:b w:val="0"/>
           <w:i w:val="0"/>
           <w:sz w:val="18"/>
+          <w:color w:val="000000"/>
         </w:rPr>
         <w:t xml:space="preserve">  │       ├── mi_estimator.py</w:t>
       </w:r>
@@ -1217,6 +1295,7 @@
           <w:b w:val="0"/>
           <w:i w:val="0"/>
           <w:sz w:val="18"/>
+          <w:color w:val="000000"/>
         </w:rPr>
         <w:t xml:space="preserve">  — InfoNCE / L1Out MI 估计器</w:t>
       </w:r>
@@ -1228,6 +1307,7 @@
           <w:b w:val="0"/>
           <w:i w:val="0"/>
           <w:sz w:val="18"/>
+          <w:color w:val="000000"/>
         </w:rPr>
         <w:t xml:space="preserve">  │       └── gat_module.py</w:t>
       </w:r>
@@ -1236,6 +1316,7 @@
           <w:b w:val="0"/>
           <w:i w:val="0"/>
           <w:sz w:val="18"/>
+          <w:color w:val="000000"/>
         </w:rPr>
         <w:t xml:space="preserve">  — GAT 图注意力通信模块</w:t>
       </w:r>
@@ -1247,6 +1328,7 @@
           <w:b w:val="0"/>
           <w:i w:val="0"/>
           <w:sz w:val="18"/>
+          <w:color w:val="000000"/>
         </w:rPr>
         <w:t xml:space="preserve">  ├── trainers/</w:t>
       </w:r>
@@ -1255,6 +1337,7 @@
           <w:b w:val="0"/>
           <w:i w:val="0"/>
           <w:sz w:val="18"/>
+          <w:color w:val="000000"/>
         </w:rPr>
         <w:t xml:space="preserve">  — 训练脚本</w:t>
       </w:r>
@@ -1266,6 +1349,7 @@
           <w:b w:val="0"/>
           <w:i w:val="0"/>
           <w:sz w:val="18"/>
+          <w:color w:val="000000"/>
         </w:rPr>
         <w:t xml:space="preserve">  │   ├── stage1_train.py</w:t>
       </w:r>
@@ -1274,6 +1358,7 @@
           <w:b w:val="0"/>
           <w:i w:val="0"/>
           <w:sz w:val="18"/>
+          <w:color w:val="000000"/>
         </w:rPr>
         <w:t xml:space="preserve">  — IPPO 训练循环</w:t>
       </w:r>
@@ -1285,6 +1370,7 @@
           <w:b w:val="0"/>
           <w:i w:val="0"/>
           <w:sz w:val="18"/>
+          <w:color w:val="000000"/>
         </w:rPr>
         <w:t xml:space="preserve">  │   ├── stage2_train.py</w:t>
       </w:r>
@@ -1293,6 +1379,7 @@
           <w:b w:val="0"/>
           <w:i w:val="0"/>
           <w:sz w:val="18"/>
+          <w:color w:val="000000"/>
         </w:rPr>
         <w:t xml:space="preserve">  — ExplabOff 训练循环</w:t>
       </w:r>
@@ -1304,6 +1391,7 @@
           <w:b w:val="0"/>
           <w:i w:val="0"/>
           <w:sz w:val="18"/>
+          <w:color w:val="000000"/>
         </w:rPr>
         <w:t xml:space="preserve">  │   └── stage3_train.py</w:t>
       </w:r>
@@ -1312,6 +1400,7 @@
           <w:b w:val="0"/>
           <w:i w:val="0"/>
           <w:sz w:val="18"/>
+          <w:color w:val="000000"/>
         </w:rPr>
         <w:t xml:space="preserve">  — 课程学习 + GNN 训练</w:t>
       </w:r>
@@ -1323,6 +1412,7 @@
           <w:b w:val="0"/>
           <w:i w:val="0"/>
           <w:sz w:val="18"/>
+          <w:color w:val="000000"/>
         </w:rPr>
         <w:t xml:space="preserve">  ├── configs/</w:t>
       </w:r>
@@ -1331,6 +1421,7 @@
           <w:b w:val="0"/>
           <w:i w:val="0"/>
           <w:sz w:val="18"/>
+          <w:color w:val="000000"/>
         </w:rPr>
         <w:t xml:space="preserve">  — YAML 配置</w:t>
       </w:r>
@@ -1342,6 +1433,7 @@
           <w:b w:val="0"/>
           <w:i w:val="0"/>
           <w:sz w:val="18"/>
+          <w:color w:val="000000"/>
         </w:rPr>
         <w:t xml:space="preserve">  │   ├── default.yaml</w:t>
       </w:r>
@@ -1350,6 +1442,7 @@
           <w:b w:val="0"/>
           <w:i w:val="0"/>
           <w:sz w:val="18"/>
+          <w:color w:val="000000"/>
         </w:rPr>
         <w:t xml:space="preserve">  — Stage 1 配置</w:t>
       </w:r>
@@ -1361,6 +1454,7 @@
           <w:b w:val="0"/>
           <w:i w:val="0"/>
           <w:sz w:val="18"/>
+          <w:color w:val="000000"/>
         </w:rPr>
         <w:t xml:space="preserve">  │   ├── explaboff.yaml</w:t>
       </w:r>
@@ -1369,6 +1463,7 @@
           <w:b w:val="0"/>
           <w:i w:val="0"/>
           <w:sz w:val="18"/>
+          <w:color w:val="000000"/>
         </w:rPr>
         <w:t xml:space="preserve">  — Stage 2 配置</w:t>
       </w:r>
@@ -1380,6 +1475,7 @@
           <w:b w:val="0"/>
           <w:i w:val="0"/>
           <w:sz w:val="18"/>
+          <w:color w:val="000000"/>
         </w:rPr>
         <w:t xml:space="preserve">  │   └── large_scale.yaml</w:t>
       </w:r>
@@ -1388,6 +1484,7 @@
           <w:b w:val="0"/>
           <w:i w:val="0"/>
           <w:sz w:val="18"/>
+          <w:color w:val="000000"/>
         </w:rPr>
         <w:t xml:space="preserve">  — Stage 3 配置</w:t>
       </w:r>
@@ -1399,6 +1496,7 @@
           <w:b w:val="0"/>
           <w:i w:val="0"/>
           <w:sz w:val="18"/>
+          <w:color w:val="000000"/>
         </w:rPr>
         <w:t xml:space="preserve">  ├── utils/</w:t>
       </w:r>
@@ -1407,6 +1505,7 @@
           <w:b w:val="0"/>
           <w:i w:val="0"/>
           <w:sz w:val="18"/>
+          <w:color w:val="000000"/>
         </w:rPr>
         <w:t xml:space="preserve">  — 工具模块（完整实现）</w:t>
       </w:r>
@@ -1418,6 +1517,7 @@
           <w:b w:val="0"/>
           <w:i w:val="0"/>
           <w:sz w:val="18"/>
+          <w:color w:val="000000"/>
         </w:rPr>
         <w:t xml:space="preserve">  │   ├── task_device.py</w:t>
       </w:r>
@@ -1426,6 +1526,7 @@
           <w:b w:val="0"/>
           <w:i w:val="0"/>
           <w:sz w:val="18"/>
+          <w:color w:val="000000"/>
         </w:rPr>
         <w:t xml:space="preserve">  — Task / Device 数据类</w:t>
       </w:r>
@@ -1437,6 +1538,7 @@
           <w:b w:val="0"/>
           <w:i w:val="0"/>
           <w:sz w:val="18"/>
+          <w:color w:val="000000"/>
         </w:rPr>
         <w:t xml:space="preserve">  │   ├── helpers.py</w:t>
       </w:r>
@@ -1445,6 +1547,7 @@
           <w:b w:val="0"/>
           <w:i w:val="0"/>
           <w:sz w:val="18"/>
+          <w:color w:val="000000"/>
         </w:rPr>
         <w:t xml:space="preserve">  — 延迟 / 能耗 / 公平性计算</w:t>
       </w:r>
@@ -1456,6 +1559,7 @@
           <w:b w:val="0"/>
           <w:i w:val="0"/>
           <w:sz w:val="18"/>
+          <w:color w:val="000000"/>
         </w:rPr>
         <w:t xml:space="preserve">  │   └── metrics.py</w:t>
       </w:r>
@@ -1464,6 +1568,7 @@
           <w:b w:val="0"/>
           <w:i w:val="0"/>
           <w:sz w:val="18"/>
+          <w:color w:val="000000"/>
         </w:rPr>
         <w:t xml:space="preserve">  — MetricsCollector</w:t>
       </w:r>
@@ -1475,6 +1580,7 @@
           <w:b w:val="0"/>
           <w:i w:val="0"/>
           <w:sz w:val="18"/>
+          <w:color w:val="000000"/>
         </w:rPr>
         <w:t xml:space="preserve">  └── evaluation/</w:t>
       </w:r>
@@ -1483,6 +1589,7 @@
           <w:b w:val="0"/>
           <w:i w:val="0"/>
           <w:sz w:val="18"/>
+          <w:color w:val="000000"/>
         </w:rPr>
         <w:t xml:space="preserve">  — 评估脚本</w:t>
       </w:r>
@@ -1494,6 +1601,7 @@
           <w:b w:val="0"/>
           <w:i w:val="0"/>
           <w:sz w:val="18"/>
+          <w:color w:val="000000"/>
         </w:rPr>
         <w:t xml:space="preserve">      └── compare.py</w:t>
       </w:r>
@@ -1502,6 +1610,7 @@
           <w:b w:val="0"/>
           <w:i w:val="0"/>
           <w:sz w:val="18"/>
+          <w:color w:val="000000"/>
         </w:rPr>
         <w:t xml:space="preserve">  — 算法对比套件</w:t>
       </w:r>
@@ -1512,6 +1621,9 @@
       </w:pPr>
       <w:r>
         <w:t>4. 快速开始</w:t>
+        <w:rPr>
+          <w:color w:val="000000"/>
+        </w:rPr>
       </w:r>
     </w:p>
     <w:p>
@@ -1520,6 +1632,9 @@
       </w:pPr>
       <w:r>
         <w:t>4.1 环境要求</w:t>
+        <w:rPr>
+          <w:color w:val="000000"/>
+        </w:rPr>
       </w:r>
     </w:p>
     <w:p>
@@ -1527,6 +1642,7 @@
         <w:rPr>
           <w:b w:val="0"/>
           <w:i w:val="0"/>
+          <w:color w:val="000000"/>
         </w:rPr>
         <w:t>Python 3.10+  ·  PyTorch 1.13+（可选 CUDA 12.1+）  ·  内存 8GB+</w:t>
         <w:br/>
@@ -1539,6 +1655,9 @@
       </w:pPr>
       <w:r>
         <w:t>4.2 环境快速验证</w:t>
+        <w:rPr>
+          <w:color w:val="000000"/>
+        </w:rPr>
       </w:r>
     </w:p>
     <w:p>
@@ -1546,6 +1665,7 @@
         <w:rPr>
           <w:b w:val="0"/>
           <w:i w:val="0"/>
+          <w:color w:val="000000"/>
         </w:rPr>
         <w:t>验证 PettingZoo 环境：</w:t>
       </w:r>
@@ -1557,6 +1677,7 @@
           <w:b w:val="0"/>
           <w:i w:val="0"/>
           <w:sz w:val="16"/>
+          <w:color w:val="000000"/>
         </w:rPr>
         <w:t>python -c "from envs.edge_offload_env import EdgeOffloadEnv; env=EdgeOffloadEnv(num_devices=5,num_servers=3); obs,_=env.reset(); actions={a:{'offload_ratio':0.5,'target_es':1} for a in env.agents}; o,r,t,tr,i=env.step(actions)"</w:t>
       </w:r>
@@ -1567,6 +1688,9 @@
       </w:pPr>
       <w:r>
         <w:t>4.3 启动训练</w:t>
+        <w:rPr>
+          <w:color w:val="000000"/>
+        </w:rPr>
       </w:r>
     </w:p>
     <w:p>
@@ -1574,6 +1698,7 @@
         <w:rPr>
           <w:b w:val="0"/>
           <w:i w:val="0"/>
+          <w:color w:val="000000"/>
         </w:rPr>
         <w:t>python trainers/stage1_train.py --config configs/default.yaml --episodes 500</w:t>
       </w:r>
@@ -1584,6 +1709,9 @@
       </w:pPr>
       <w:r>
         <w:t>5. 环境接口（API）</w:t>
+        <w:rPr>
+          <w:color w:val="000000"/>
+        </w:rPr>
       </w:r>
     </w:p>
     <w:p>
@@ -1591,6 +1719,7 @@
         <w:rPr>
           <w:b w:val="0"/>
           <w:i w:val="0"/>
+          <w:color w:val="000000"/>
         </w:rPr>
         <w:t>EdgeOffloadEnv 继承 PettingZoo 的 ParallelEnv。所有智能体每时隙同步决策。</w:t>
       </w:r>
@@ -1601,6 +1730,9 @@
       </w:pPr>
       <w:r>
         <w:t>5.1 构造参数</w:t>
+        <w:rPr>
+          <w:color w:val="000000"/>
+        </w:rPr>
       </w:r>
     </w:p>
     <w:tbl>
@@ -2126,6 +2258,9 @@
       </w:pPr>
       <w:r>
         <w:t>5.2 关键方法</w:t>
+        <w:rPr>
+          <w:color w:val="000000"/>
+        </w:rPr>
       </w:r>
     </w:p>
     <w:p>
@@ -2134,6 +2269,7 @@
           <w:rFonts w:ascii="Consolas" w:hAnsi="Consolas"/>
           <w:b w:val="0"/>
           <w:i w:val="0"/>
+          <w:color w:val="000000"/>
         </w:rPr>
         <w:t>reset(seed=None)</w:t>
       </w:r>
@@ -2141,6 +2277,7 @@
         <w:rPr>
           <w:b w:val="0"/>
           <w:i w:val="0"/>
+          <w:color w:val="000000"/>
         </w:rPr>
         <w:t xml:space="preserve">  → (obs, infos)，重置环境并返回局部观测</w:t>
       </w:r>
@@ -2151,6 +2288,7 @@
           <w:rFonts w:ascii="Consolas" w:hAnsi="Consolas"/>
           <w:b w:val="0"/>
           <w:i w:val="0"/>
+          <w:color w:val="000000"/>
         </w:rPr>
         <w:t>step(actions)</w:t>
       </w:r>
@@ -2158,6 +2296,7 @@
         <w:rPr>
           <w:b w:val="0"/>
           <w:i w:val="0"/>
+          <w:color w:val="000000"/>
         </w:rPr>
         <w:t xml:space="preserve">  执行一个时隙。actions = {"device_0": {"offload_ratio": 0.5, "target_es": 2}}</w:t>
       </w:r>
@@ -2168,6 +2307,7 @@
           <w:rFonts w:ascii="Consolas" w:hAnsi="Consolas"/>
           <w:b w:val="0"/>
           <w:i w:val="0"/>
+          <w:color w:val="000000"/>
         </w:rPr>
         <w:t>render()</w:t>
       </w:r>
@@ -2175,6 +2315,7 @@
         <w:rPr>
           <w:b w:val="0"/>
           <w:i w:val="0"/>
+          <w:color w:val="000000"/>
         </w:rPr>
         <w:t xml:space="preserve">  文本格式渲染环境状态（每时隙）</w:t>
       </w:r>
@@ -2185,6 +2326,7 @@
           <w:rFonts w:ascii="Consolas" w:hAnsi="Consolas"/>
           <w:b w:val="0"/>
           <w:i w:val="0"/>
+          <w:color w:val="000000"/>
         </w:rPr>
         <w:t>get_episode_metrics()</w:t>
       </w:r>
@@ -2192,6 +2334,7 @@
         <w:rPr>
           <w:b w:val="0"/>
           <w:i w:val="0"/>
+          <w:color w:val="000000"/>
         </w:rPr>
         <w:t xml:space="preserve">  → {completion_rate, avg_energy, avg_latency}</w:t>
       </w:r>
@@ -2202,6 +2345,9 @@
       </w:pPr>
       <w:r>
         <w:t>5.3 观测空间</w:t>
+        <w:rPr>
+          <w:color w:val="000000"/>
+        </w:rPr>
       </w:r>
     </w:p>
     <w:p>
@@ -2209,6 +2355,7 @@
         <w:rPr>
           <w:b w:val="0"/>
           <w:i w:val="0"/>
+          <w:color w:val="000000"/>
         </w:rPr>
         <w:t>每个 agent 接收 (3 + E) 维局部观测向量：</w:t>
       </w:r>
@@ -2218,6 +2365,7 @@
         <w:rPr>
           <w:b w:val="0"/>
           <w:i w:val="0"/>
+          <w:color w:val="000000"/>
         </w:rPr>
         <w:t>[0] 当前任务数据量（归一化）  [1] 最大容忍延迟  [2] 剩余能量比例  [3:3+E] 各 ES 队列估计</w:t>
       </w:r>
@@ -2228,6 +2376,9 @@
       </w:pPr>
       <w:r>
         <w:t>5.4 动作空间</w:t>
+        <w:rPr>
+          <w:color w:val="000000"/>
+        </w:rPr>
       </w:r>
     </w:p>
     <w:p>
@@ -2235,6 +2386,7 @@
         <w:rPr>
           <w:b w:val="0"/>
           <w:i w:val="0"/>
+          <w:color w:val="000000"/>
         </w:rPr>
         <w:t>offload_ratio: float ∈ [0, 1] — 卸载比例</w:t>
       </w:r>
@@ -2244,6 +2396,7 @@
         <w:rPr>
           <w:b w:val="0"/>
           <w:i w:val="0"/>
+          <w:color w:val="000000"/>
         </w:rPr>
         <w:t>target_es: int ∈ {0, ..., E} — 0=本地执行, 1..E=目标 ES</w:t>
       </w:r>
@@ -2254,6 +2407,9 @@
       </w:pPr>
       <w:r>
         <w:t>6. 算法管线</w:t>
+        <w:rPr>
+          <w:color w:val="000000"/>
+        </w:rPr>
       </w:r>
     </w:p>
     <w:p>
@@ -2262,6 +2418,9 @@
       </w:pPr>
       <w:r>
         <w:t>6.1 Stage 1：IPPO 基线（30%）</w:t>
+        <w:rPr>
+          <w:color w:val="000000"/>
+        </w:rPr>
       </w:r>
     </w:p>
     <w:p>
@@ -2269,6 +2428,7 @@
         <w:rPr>
           <w:b w:val="0"/>
           <w:i w:val="0"/>
+          <w:color w:val="000000"/>
         </w:rPr>
         <w:t>独立 PPO + 参数共享。每台 MD 维护独立的 Actor-Critic 网络，所有 agent 共享权重但独立计算 loss。无智能体间通信，每个 agent 仅使用局部观测做决策。通过 agent ID embedding 区分不同设备。</w:t>
       </w:r>
@@ -2278,6 +2438,7 @@
         <w:rPr>
           <w:b w:val="0"/>
           <w:i w:val="0"/>
+          <w:color w:val="000000"/>
         </w:rPr>
         <w:t>对比基线：同步实现 MAPPO（集中式 Critic 使用全局状态）。</w:t>
       </w:r>
@@ -2287,6 +2448,7 @@
         <w:rPr>
           <w:b w:val="0"/>
           <w:i w:val="0"/>
+          <w:color w:val="000000"/>
         </w:rPr>
         <w:t>参考：de Witt et al., ICLR 2020; Yu et al., NeurIPS 2022.</w:t>
       </w:r>
@@ -2297,6 +2459,9 @@
       </w:pPr>
       <w:r>
         <w:t>6.2 Stage 2：ExplabOff 互信息方案（35%）</w:t>
+        <w:rPr>
+          <w:color w:val="000000"/>
+        </w:rPr>
       </w:r>
     </w:p>
     <w:p>
@@ -2304,6 +2469,7 @@
         <w:rPr>
           <w:b w:val="0"/>
           <w:i w:val="0"/>
+          <w:color w:val="000000"/>
         </w:rPr>
         <w:t>互信息（MI）增强的 MARL。Critic 目标函数引入全局状态与联合动作的互信息：</w:t>
       </w:r>
@@ -2459,6 +2625,7 @@
         <w:rPr>
           <w:b w:val="0"/>
           <w:i w:val="0"/>
+          <w:color w:val="000000"/>
         </w:rPr>
         <w:t>其中 I(s; a) 通过三个熵项组合推导而来：</w:t>
       </w:r>
@@ -2654,6 +2821,7 @@
         <w:rPr>
           <w:b w:val="0"/>
           <w:i w:val="0"/>
+          <w:color w:val="000000"/>
         </w:rPr>
         <w:t>三个熵项的含义：</w:t>
       </w:r>
@@ -2663,6 +2831,7 @@
         <w:rPr>
           <w:b w:val="0"/>
           <w:i w:val="0"/>
+          <w:color w:val="000000"/>
         </w:rPr>
         <w:t xml:space="preserve">  +H(a)：最大化联合动作熵（探索更多卸载组合）</w:t>
       </w:r>
@@ -2672,6 +2841,7 @@
         <w:rPr>
           <w:b w:val="0"/>
           <w:i w:val="0"/>
+          <w:color w:val="000000"/>
         </w:rPr>
         <w:t xml:space="preserve">  −H(a⁻ᵐ | aᵐ, s)：最小化对他人动作的不确定性（促进协作）</w:t>
       </w:r>
@@ -2681,6 +2851,7 @@
         <w:rPr>
           <w:b w:val="0"/>
           <w:i w:val="0"/>
+          <w:color w:val="000000"/>
         </w:rPr>
         <w:t xml:space="preserve">  −H(aᵐ | s)：给定状态时动作应确定（避免随机探索干扰）</w:t>
       </w:r>
@@ -2690,6 +2861,7 @@
         <w:rPr>
           <w:b w:val="0"/>
           <w:i w:val="0"/>
+          <w:color w:val="000000"/>
         </w:rPr>
       </w:r>
     </w:p>
@@ -2698,6 +2870,7 @@
         <w:rPr>
           <w:b/>
           <w:i w:val="0"/>
+          <w:color w:val="000000"/>
         </w:rPr>
         <w:t>区分优质与劣质协作：</w:t>
       </w:r>
@@ -2707,6 +2880,7 @@
         <w:rPr>
           <w:b w:val="0"/>
           <w:i w:val="0"/>
+          <w:color w:val="000000"/>
         </w:rPr>
         <w:t>• B+ buffer（优质 episode）：InfoNCE 估计 MI 下界并最大化 → 强化最优协作</w:t>
       </w:r>
@@ -2716,6 +2890,7 @@
         <w:rPr>
           <w:b w:val="0"/>
           <w:i w:val="0"/>
+          <w:color w:val="000000"/>
         </w:rPr>
         <w:t>• B- buffer（劣质 episode）：L1Out 估计 MI 上界并最小化 → 打破次优协作</w:t>
       </w:r>
@@ -2895,6 +3070,7 @@
         <w:rPr>
           <w:b w:val="0"/>
           <w:i w:val="0"/>
+          <w:color w:val="000000"/>
         </w:rPr>
         <w:t>增强奖励仅用于 Critic 训练，Actor 执行时仍只用局部观测。</w:t>
       </w:r>
@@ -2904,6 +3080,7 @@
         <w:rPr>
           <w:b w:val="0"/>
           <w:i w:val="0"/>
+          <w:color w:val="000000"/>
         </w:rPr>
         <w:t>参考：Ren et al., "ExplabOff", IEEE INFOCOM 2025 (CCF-A).</w:t>
       </w:r>
@@ -2914,6 +3091,9 @@
       </w:pPr>
       <w:r>
         <w:t>6.3 Stage 3：大规模 GNN 通信（35%）</w:t>
+        <w:rPr>
+          <w:color w:val="000000"/>
+        </w:rPr>
       </w:r>
     </w:p>
     <w:p>
@@ -2921,6 +3101,7 @@
         <w:rPr>
           <w:b w:val="0"/>
           <w:i w:val="0"/>
+          <w:color w:val="000000"/>
         </w:rPr>
         <w:t>三层可扩展设计：</w:t>
       </w:r>
@@ -2930,6 +3111,7 @@
         <w:rPr>
           <w:b w:val="0"/>
           <w:i w:val="0"/>
+          <w:color w:val="000000"/>
         </w:rPr>
         <w:t>1. 参数共享 + Agent ID Embedding：全 MD 共享网络权重，新增 MD 只需分配新的 embedding 向量。</w:t>
       </w:r>
@@ -2939,6 +3121,7 @@
         <w:rPr>
           <w:b w:val="0"/>
           <w:i w:val="0"/>
+          <w:color w:val="000000"/>
         </w:rPr>
         <w:t>2. GNN 邻域通信（GNNComm-MARL）：图节点 = MD，边 = 物理距离 + 共享 ES 竞争。邻接矩阵通过高斯核构造，阈值截断。GAT 聚合 top-k 邻域消息。</w:t>
       </w:r>
@@ -2948,6 +3131,7 @@
         <w:rPr>
           <w:b w:val="0"/>
           <w:i w:val="0"/>
+          <w:color w:val="000000"/>
         </w:rPr>
         <w:t>3. 课程学习：5 → 10 → 20 → 50 设备逐步训练，继承权重并冻结底层 GNN 编码器。</w:t>
       </w:r>
@@ -2957,6 +3141,7 @@
         <w:rPr>
           <w:b w:val="0"/>
           <w:i w:val="0"/>
+          <w:color w:val="000000"/>
         </w:rPr>
         <w:t>参考：GNNComm-MARL (IEEE 2024); TapFinger (IEEE TPDS 2023); FGNN-MADRL (arXiv:2407.02342).</w:t>
       </w:r>
@@ -2967,6 +3152,9 @@
       </w:pPr>
       <w:r>
         <w:t>7. 配置参数说明</w:t>
+        <w:rPr>
+          <w:color w:val="000000"/>
+        </w:rPr>
       </w:r>
     </w:p>
     <w:p>
@@ -2974,6 +3162,7 @@
         <w:rPr>
           <w:b w:val="0"/>
           <w:i w:val="0"/>
+          <w:color w:val="000000"/>
         </w:rPr>
         <w:t>三个 YAML 配置文件：default.yaml / explaboff.yaml / large_scale.yaml</w:t>
       </w:r>
@@ -3303,6 +3492,9 @@
       </w:pPr>
       <w:r>
         <w:t>8. 参考文献</w:t>
+        <w:rPr>
+          <w:color w:val="000000"/>
+        </w:rPr>
       </w:r>
     </w:p>
     <w:tbl>
@@ -3744,6 +3936,9 @@
       </w:pPr>
       <w:r>
         <w:t>9. 参数来源索引</w:t>
+        <w:rPr>
+          <w:color w:val="000000"/>
+        </w:rPr>
       </w:r>
     </w:p>
     <w:tbl>

</xml_diff>